<commit_message>
Split practical work 3 entities into modules
</commit_message>
<xml_diff>
--- a/Отчет_ПР3_Есина_В.Д.docx
+++ b/Отчет_ПР3_Есина_В.Д.docx
@@ -1547,10 +1547,9 @@
       <w:r>
         <w:rPr>
           <w:rFonts w:ascii="Times New Roman" w:hAnsi="Times New Roman"/>
-          <w:b w:val="0"/>
           <w:sz w:val="24"/>
         </w:rPr>
-        <w:t>Созданы классы Room, User, Event и Schedule. Room хранит характеристики помещения и проверяет вместимость. User представляет организатора и инкапсулирует проверяемое свойство email. Event связывает объекты пользователя и помещения, вычисляет продолжительность и проверяет пересечение. Schedule содержит мероприятия и управляет расписанием.</w:t>
+        <w:t>Созданы классы Room, User, Event и Schedule. Каждая сущность размещена в отдельном модуле: room.py, user.py, event.py и schedule.py. Room хранит характеристики помещения и проверяет вместимость. User представляет организатора и инкапсулирует проверяемое свойство email. Event связывает объекты пользователя и помещения, вычисляет продолжительность и проверяет пересечение. Schedule содержит мероприятия и управляет расписанием. Операции с каталогом помещений вынесены в room_service.py. Репозиторий: https://github.com/ba0baber/trsp1.</w:t>
       </w:r>
     </w:p>
     <w:p>
@@ -1634,7 +1633,7 @@
           <w:b w:val="0"/>
           <w:sz w:val="24"/>
         </w:rPr>
-        <w:t>Автоматизированные тесты адаптированы к объектной модели: успешно проходят 19 тестов. flake8 не обнаруживает замечаний, README.md обновлён. Контрольная версия ПР3 зафиксирована коммитом 9eeff96.</w:t>
+        <w:t>Автоматизированные тесты адаптированы к объектной модели: успешно проходят 19 тестов. flake8 не обнаруживает замечаний, README.md обновлён. Результат ПР3 зафиксирован в Git.</w:t>
       </w:r>
     </w:p>
     <w:p>

</xml_diff>